<commit_message>
Update MITM Team 49 Assignment.docx
Complete Problem 1 and finalize MITM report
</commit_message>
<xml_diff>
--- a/MITM Team 49 Assignment.docx
+++ b/MITM Team 49 Assignment.docx
@@ -35,11 +35,1222 @@
         <w:rPr>
           <w:rFonts w:ascii="Times New Roman" w:hAnsi="Times New Roman" w:cs="Times New Roman"/>
         </w:rPr>
-        <w:t>Lucie Spanbauer, Ashraf Mirza, Monish Sreekanth, kmm9660</w:t>
-      </w:r>
-    </w:p>
-    <w:p>
-      <w:pPr>
+        <w:t xml:space="preserve">Lucie Spanbauer, Ashraf Mirza, Monish Sreekanth, </w:t>
+      </w:r>
+      <w:r>
+        <w:rPr>
+          <w:rFonts w:ascii="Times New Roman" w:hAnsi="Times New Roman" w:cs="Times New Roman"/>
+        </w:rPr>
+        <w:t>Kazi Mustakim</w:t>
+      </w:r>
+    </w:p>
+    <w:p>
+      <w:pPr>
+        <w:spacing w:after="0"/>
+      </w:pPr>
+      <w:r>
+        <w:rPr>
+          <w:rFonts w:ascii="Times New Roman" w:hAnsi="Times New Roman"/>
+          <w:b/>
+          <w:sz w:val="28"/>
+        </w:rPr>
+        <w:t>Problem 1- Modes of Operation</w:t>
+      </w:r>
+    </w:p>
+    <w:p>
+      <w:pPr>
+        <w:spacing w:after="0"/>
+      </w:pPr>
+      <w:r>
+        <w:rPr>
+          <w:rFonts w:ascii="Times New Roman" w:hAnsi="Times New Roman"/>
+        </w:rPr>
+        <w:t>The plaintext is FOO. Using the A-P mapping provided in the assignment:</w:t>
+      </w:r>
+    </w:p>
+    <w:p>
+      <w:pPr>
+        <w:spacing w:after="0"/>
+        <w:jc w:val="center"/>
+      </w:pPr>
+      <w:r>
+        <w:rPr>
+          <w:rFonts w:ascii="Times New Roman" w:hAnsi="Times New Roman"/>
+        </w:rPr>
+        <w:t>F=0101    O=1110    O=1110</w:t>
+      </w:r>
+    </w:p>
+    <w:p>
+      <w:pPr>
+        <w:spacing w:after="0"/>
+      </w:pPr>
+      <w:r>
+        <w:rPr>
+          <w:rFonts w:ascii="Times New Roman" w:hAnsi="Times New Roman"/>
+        </w:rPr>
+        <w:t>Therefore, the plaintext blocks are:</w:t>
+      </w:r>
+    </w:p>
+    <w:p>
+      <w:pPr>
+        <w:spacing w:after="0"/>
+        <w:jc w:val="center"/>
+      </w:pPr>
+      <w:r>
+        <w:rPr>
+          <w:rFonts w:ascii="Times New Roman" w:hAnsi="Times New Roman"/>
+        </w:rPr>
+        <w:t>m1=0101    m2=1110    m3=1110</w:t>
+      </w:r>
+    </w:p>
+    <w:p>
+      <w:pPr>
+        <w:spacing w:after="0"/>
+      </w:pPr>
+      <w:r>
+        <w:rPr>
+          <w:rFonts w:ascii="Times New Roman" w:hAnsi="Times New Roman"/>
+        </w:rPr>
+        <w:t>No padding is needed because each plaintext letter already forms one 4-bit block.</w:t>
+      </w:r>
+    </w:p>
+    <w:p>
+      <w:pPr>
+        <w:spacing w:after="0"/>
+      </w:pPr>
+    </w:p>
+    <w:p>
+      <w:pPr>
+        <w:spacing w:after="0"/>
+      </w:pPr>
+      <w:r>
+        <w:rPr>
+          <w:rFonts w:ascii="Times New Roman" w:hAnsi="Times New Roman"/>
+        </w:rPr>
+        <w:t>1.1 Encryption Setup</w:t>
+      </w:r>
+    </w:p>
+    <w:p>
+      <w:pPr>
+        <w:spacing w:after="0"/>
+      </w:pPr>
+      <w:r>
+        <w:rPr>
+          <w:rFonts w:ascii="Times New Roman" w:hAnsi="Times New Roman"/>
+        </w:rPr>
+        <w:t>The hypothetical 4-bit block cipher is:</w:t>
+      </w:r>
+    </w:p>
+    <w:p>
+      <w:pPr>
+        <w:spacing w:after="0"/>
+        <w:jc w:val="center"/>
+      </w:pPr>
+      <w:r>
+        <w:rPr>
+          <w:rFonts w:ascii="Times New Roman" w:hAnsi="Times New Roman"/>
+        </w:rPr>
+        <w:t>Ek(b1b2b3b4)=(b2b3b1b4)</w:t>
+      </w:r>
+    </w:p>
+    <w:p>
+      <w:pPr>
+        <w:spacing w:after="0"/>
+      </w:pPr>
+      <w:r>
+        <w:rPr>
+          <w:rFonts w:ascii="Times New Roman" w:hAnsi="Times New Roman"/>
+        </w:rPr>
+        <w:t>The cipher only rearranges the bit positions. To decrypt, the original positions are restored. If c1c2c3c4=(b2b3b1b4), then:</w:t>
+      </w:r>
+    </w:p>
+    <w:p>
+      <w:pPr>
+        <w:spacing w:after="0"/>
+        <w:jc w:val="center"/>
+      </w:pPr>
+      <w:r>
+        <w:rPr>
+          <w:rFonts w:ascii="Times New Roman" w:hAnsi="Times New Roman"/>
+        </w:rPr>
+        <w:t>Dk(c1c2c3c4)=(c3c1c2c4)</w:t>
+      </w:r>
+    </w:p>
+    <w:p>
+      <w:pPr>
+        <w:spacing w:after="0"/>
+      </w:pPr>
+    </w:p>
+    <w:p>
+      <w:pPr>
+        <w:spacing w:after="0"/>
+      </w:pPr>
+      <w:r>
+        <w:rPr>
+          <w:rFonts w:ascii="Times New Roman" w:hAnsi="Times New Roman"/>
+        </w:rPr>
+        <w:t>1.2 Task 2a – ECB Encryption</w:t>
+      </w:r>
+    </w:p>
+    <w:p>
+      <w:pPr>
+        <w:spacing w:after="0"/>
+      </w:pPr>
+      <w:r>
+        <w:rPr>
+          <w:rFonts w:ascii="Times New Roman" w:hAnsi="Times New Roman"/>
+        </w:rPr>
+        <w:t>According to the class notes, ECB encrypts each plaintext block independently:</w:t>
+      </w:r>
+    </w:p>
+    <w:p>
+      <w:pPr>
+        <w:spacing w:after="0"/>
+        <w:jc w:val="center"/>
+      </w:pPr>
+      <w:r>
+        <w:rPr>
+          <w:rFonts w:ascii="Times New Roman" w:hAnsi="Times New Roman"/>
+        </w:rPr>
+        <w:t>ci=Ek(mi)</w:t>
+      </w:r>
+    </w:p>
+    <w:p>
+      <w:pPr>
+        <w:spacing w:after="0"/>
+      </w:pPr>
+      <w:r>
+        <w:rPr>
+          <w:rFonts w:ascii="Times New Roman" w:hAnsi="Times New Roman"/>
+        </w:rPr>
+        <w:t>Block 1:</w:t>
+      </w:r>
+    </w:p>
+    <w:p>
+      <w:pPr>
+        <w:spacing w:after="0"/>
+        <w:jc w:val="center"/>
+      </w:pPr>
+      <w:r>
+        <w:rPr>
+          <w:rFonts w:ascii="Times New Roman" w:hAnsi="Times New Roman"/>
+        </w:rPr>
+        <w:t>m1=0101</w:t>
+      </w:r>
+    </w:p>
+    <w:p>
+      <w:pPr>
+        <w:spacing w:after="0"/>
+        <w:jc w:val="center"/>
+      </w:pPr>
+      <w:r>
+        <w:rPr>
+          <w:rFonts w:ascii="Times New Roman" w:hAnsi="Times New Roman"/>
+        </w:rPr>
+        <w:t>Ek(0101)=1001=J</w:t>
+      </w:r>
+    </w:p>
+    <w:p>
+      <w:pPr>
+        <w:spacing w:after="0"/>
+      </w:pPr>
+      <w:r>
+        <w:rPr>
+          <w:rFonts w:ascii="Times New Roman" w:hAnsi="Times New Roman"/>
+        </w:rPr>
+        <w:t>Block 2:</w:t>
+      </w:r>
+    </w:p>
+    <w:p>
+      <w:pPr>
+        <w:spacing w:after="0"/>
+        <w:jc w:val="center"/>
+      </w:pPr>
+      <w:r>
+        <w:rPr>
+          <w:rFonts w:ascii="Times New Roman" w:hAnsi="Times New Roman"/>
+        </w:rPr>
+        <w:t>m2=1110</w:t>
+      </w:r>
+    </w:p>
+    <w:p>
+      <w:pPr>
+        <w:spacing w:after="0"/>
+        <w:jc w:val="center"/>
+      </w:pPr>
+      <w:r>
+        <w:rPr>
+          <w:rFonts w:ascii="Times New Roman" w:hAnsi="Times New Roman"/>
+        </w:rPr>
+        <w:t>Ek(1110)=1110=O</w:t>
+      </w:r>
+    </w:p>
+    <w:p>
+      <w:pPr>
+        <w:spacing w:after="0"/>
+      </w:pPr>
+      <w:r>
+        <w:rPr>
+          <w:rFonts w:ascii="Times New Roman" w:hAnsi="Times New Roman"/>
+        </w:rPr>
+        <w:t>Block 3:</w:t>
+      </w:r>
+    </w:p>
+    <w:p>
+      <w:pPr>
+        <w:spacing w:after="0"/>
+        <w:jc w:val="center"/>
+      </w:pPr>
+      <w:r>
+        <w:rPr>
+          <w:rFonts w:ascii="Times New Roman" w:hAnsi="Times New Roman"/>
+        </w:rPr>
+        <w:t>m3=1110</w:t>
+      </w:r>
+    </w:p>
+    <w:p>
+      <w:pPr>
+        <w:spacing w:after="0"/>
+        <w:jc w:val="center"/>
+      </w:pPr>
+      <w:r>
+        <w:rPr>
+          <w:rFonts w:ascii="Times New Roman" w:hAnsi="Times New Roman"/>
+        </w:rPr>
+        <w:t>Ek(1110)=1110=O</w:t>
+      </w:r>
+    </w:p>
+    <w:p>
+      <w:pPr>
+        <w:spacing w:after="0"/>
+      </w:pPr>
+      <w:r>
+        <w:rPr>
+          <w:rFonts w:ascii="Times New Roman" w:hAnsi="Times New Roman"/>
+        </w:rPr>
+        <w:t>Therefore:</w:t>
+      </w:r>
+    </w:p>
+    <w:p>
+      <w:pPr>
+        <w:spacing w:after="0"/>
+        <w:jc w:val="center"/>
+      </w:pPr>
+      <w:r>
+        <w:rPr>
+          <w:rFonts w:ascii="Times New Roman" w:hAnsi="Times New Roman"/>
+        </w:rPr>
+        <w:t>ECB ciphertext bits = 1001 1110 1110</w:t>
+      </w:r>
+    </w:p>
+    <w:p>
+      <w:pPr>
+        <w:spacing w:after="0"/>
+        <w:jc w:val="center"/>
+      </w:pPr>
+      <w:r>
+        <w:rPr>
+          <w:rFonts w:ascii="Times New Roman" w:hAnsi="Times New Roman"/>
+        </w:rPr>
+        <w:t>ECB ciphertext letters = JOO</w:t>
+      </w:r>
+    </w:p>
+    <w:p>
+      <w:pPr>
+        <w:spacing w:after="0"/>
+      </w:pPr>
+      <w:r>
+        <w:rPr>
+          <w:rFonts w:ascii="Times New Roman" w:hAnsi="Times New Roman"/>
+        </w:rPr>
+        <w:t>The two identical O plaintext blocks produce identical O ciphertext blocks, illustrating the fixed block mapping of ECB described in the class notes.</w:t>
+      </w:r>
+    </w:p>
+    <w:p>
+      <w:pPr>
+        <w:spacing w:after="0"/>
+      </w:pPr>
+    </w:p>
+    <w:p>
+      <w:pPr>
+        <w:spacing w:after="0"/>
+      </w:pPr>
+      <w:r>
+        <w:rPr>
+          <w:rFonts w:ascii="Times New Roman" w:hAnsi="Times New Roman"/>
+        </w:rPr>
+        <w:t>1.3 Task 2b – CBC Encryption with IV=1010</w:t>
+      </w:r>
+    </w:p>
+    <w:p>
+      <w:pPr>
+        <w:spacing w:after="0"/>
+      </w:pPr>
+      <w:r>
+        <w:rPr>
+          <w:rFonts w:ascii="Times New Roman" w:hAnsi="Times New Roman"/>
+        </w:rPr>
+        <w:t>The class notes define CBC encryption as:</w:t>
+      </w:r>
+    </w:p>
+    <w:p>
+      <w:pPr>
+        <w:spacing w:after="0"/>
+        <w:jc w:val="center"/>
+      </w:pPr>
+      <w:r>
+        <w:rPr>
+          <w:rFonts w:ascii="Times New Roman" w:hAnsi="Times New Roman"/>
+        </w:rPr>
+        <w:t>c0=IV,    ci=Ek(mi XOR ci-1)</w:t>
+      </w:r>
+    </w:p>
+    <w:p>
+      <w:pPr>
+        <w:spacing w:after="0"/>
+        <w:jc w:val="center"/>
+      </w:pPr>
+      <w:r>
+        <w:rPr>
+          <w:rFonts w:ascii="Times New Roman" w:hAnsi="Times New Roman"/>
+        </w:rPr>
+        <w:t>IV=1010</w:t>
+      </w:r>
+    </w:p>
+    <w:p>
+      <w:pPr>
+        <w:spacing w:after="0"/>
+        <w:rPr>
+          <w:rFonts w:ascii="Times New Roman" w:hAnsi="Times New Roman"/>
+        </w:rPr>
+      </w:pPr>
+    </w:p>
+    <w:p>
+      <w:pPr>
+        <w:spacing w:after="0"/>
+      </w:pPr>
+      <w:r>
+        <w:rPr>
+          <w:rFonts w:ascii="Times New Roman" w:hAnsi="Times New Roman"/>
+        </w:rPr>
+        <w:lastRenderedPageBreak/>
+        <w:t>Block 1:</w:t>
+      </w:r>
+    </w:p>
+    <w:p>
+      <w:pPr>
+        <w:spacing w:after="0"/>
+        <w:jc w:val="center"/>
+      </w:pPr>
+      <w:r>
+        <w:rPr>
+          <w:rFonts w:ascii="Times New Roman" w:hAnsi="Times New Roman"/>
+        </w:rPr>
+        <w:t>m1 XOR IV = 0101 XOR 1010 = 1111</w:t>
+      </w:r>
+    </w:p>
+    <w:p>
+      <w:pPr>
+        <w:spacing w:after="0"/>
+        <w:jc w:val="center"/>
+      </w:pPr>
+      <w:r>
+        <w:rPr>
+          <w:rFonts w:ascii="Times New Roman" w:hAnsi="Times New Roman"/>
+        </w:rPr>
+        <w:t>c1=Ek(1111)=1111=P</w:t>
+      </w:r>
+    </w:p>
+    <w:p>
+      <w:pPr>
+        <w:spacing w:after="0"/>
+      </w:pPr>
+      <w:r>
+        <w:rPr>
+          <w:rFonts w:ascii="Times New Roman" w:hAnsi="Times New Roman"/>
+        </w:rPr>
+        <w:t>Block 2:</w:t>
+      </w:r>
+    </w:p>
+    <w:p>
+      <w:pPr>
+        <w:spacing w:after="0"/>
+        <w:jc w:val="center"/>
+      </w:pPr>
+      <w:r>
+        <w:rPr>
+          <w:rFonts w:ascii="Times New Roman" w:hAnsi="Times New Roman"/>
+        </w:rPr>
+        <w:t>m2 XOR c1 = 1110 XOR 1111 = 0001</w:t>
+      </w:r>
+    </w:p>
+    <w:p>
+      <w:pPr>
+        <w:spacing w:after="0"/>
+        <w:jc w:val="center"/>
+      </w:pPr>
+      <w:r>
+        <w:rPr>
+          <w:rFonts w:ascii="Times New Roman" w:hAnsi="Times New Roman"/>
+        </w:rPr>
+        <w:t>c2=Ek(0001)=0001=B</w:t>
+      </w:r>
+    </w:p>
+    <w:p>
+      <w:pPr>
+        <w:spacing w:after="0"/>
+      </w:pPr>
+      <w:r>
+        <w:rPr>
+          <w:rFonts w:ascii="Times New Roman" w:hAnsi="Times New Roman"/>
+        </w:rPr>
+        <w:t>Block 3:</w:t>
+      </w:r>
+    </w:p>
+    <w:p>
+      <w:pPr>
+        <w:spacing w:after="0"/>
+        <w:jc w:val="center"/>
+      </w:pPr>
+      <w:r>
+        <w:rPr>
+          <w:rFonts w:ascii="Times New Roman" w:hAnsi="Times New Roman"/>
+        </w:rPr>
+        <w:t>m3 XOR c2 = 1110 XOR 0001 = 1111</w:t>
+      </w:r>
+    </w:p>
+    <w:p>
+      <w:pPr>
+        <w:spacing w:after="0"/>
+        <w:jc w:val="center"/>
+      </w:pPr>
+      <w:r>
+        <w:rPr>
+          <w:rFonts w:ascii="Times New Roman" w:hAnsi="Times New Roman"/>
+        </w:rPr>
+        <w:t>c3=Ek(1111)=1111=P</w:t>
+      </w:r>
+    </w:p>
+    <w:p>
+      <w:pPr>
+        <w:spacing w:after="0"/>
+      </w:pPr>
+      <w:r>
+        <w:rPr>
+          <w:rFonts w:ascii="Times New Roman" w:hAnsi="Times New Roman"/>
+        </w:rPr>
+        <w:t>Therefore:</w:t>
+      </w:r>
+    </w:p>
+    <w:p>
+      <w:pPr>
+        <w:spacing w:after="0"/>
+        <w:jc w:val="center"/>
+      </w:pPr>
+      <w:r>
+        <w:rPr>
+          <w:rFonts w:ascii="Times New Roman" w:hAnsi="Times New Roman"/>
+        </w:rPr>
+        <w:t>CBC encrypted data = 1111 0001 1111</w:t>
+      </w:r>
+    </w:p>
+    <w:p>
+      <w:pPr>
+        <w:spacing w:after="0"/>
+        <w:jc w:val="center"/>
+      </w:pPr>
+      <w:r>
+        <w:rPr>
+          <w:rFonts w:ascii="Times New Roman" w:hAnsi="Times New Roman"/>
+        </w:rPr>
+        <w:t>CBC ciphertext letters = PBP</w:t>
+      </w:r>
+    </w:p>
+    <w:p>
+      <w:pPr>
+        <w:spacing w:after="0"/>
+      </w:pPr>
+      <w:r>
+        <w:rPr>
+          <w:rFonts w:ascii="Times New Roman" w:hAnsi="Times New Roman"/>
+        </w:rPr>
+        <w:t>The class notes represent the transmitted CBC value as IV || c1 || c2 || c3. Including the IV, the full transmitted bit string is:</w:t>
+      </w:r>
+    </w:p>
+    <w:p>
+      <w:pPr>
+        <w:spacing w:after="0"/>
+        <w:jc w:val="center"/>
+      </w:pPr>
+      <w:r>
+        <w:rPr>
+          <w:rFonts w:ascii="Times New Roman" w:hAnsi="Times New Roman"/>
+        </w:rPr>
+        <w:t>1010 1111 0001 1111</w:t>
+      </w:r>
+    </w:p>
+    <w:p>
+      <w:pPr>
+        <w:spacing w:after="0"/>
+      </w:pPr>
+      <w:r>
+        <w:rPr>
+          <w:rFonts w:ascii="Times New Roman" w:hAnsi="Times New Roman"/>
+        </w:rPr>
+        <w:t>Using the A-P table for display only, this is K || PBP = KPBP, where K represents the IV and PBP is the encrypted plaintext.</w:t>
+      </w:r>
+    </w:p>
+    <w:p>
+      <w:pPr>
+        <w:spacing w:after="0"/>
+      </w:pPr>
+    </w:p>
+    <w:p>
+      <w:pPr>
+        <w:spacing w:after="0"/>
+      </w:pPr>
+      <w:r>
+        <w:rPr>
+          <w:rFonts w:ascii="Times New Roman" w:hAnsi="Times New Roman"/>
+        </w:rPr>
+        <w:t>1.4 Task 2c – CTR Encryption with ctr=1010</w:t>
+      </w:r>
+    </w:p>
+    <w:p>
+      <w:pPr>
+        <w:spacing w:after="0"/>
+      </w:pPr>
+      <w:r>
+        <w:rPr>
+          <w:rFonts w:ascii="Times New Roman" w:hAnsi="Times New Roman"/>
+        </w:rPr>
+        <w:t xml:space="preserve">The class-note CTR diagram uses the starting counter followed by successive counter values (counter+0, counter+1, counter+2). For the three </w:t>
+      </w:r>
+      <w:proofErr w:type="gramStart"/>
+      <w:r>
+        <w:rPr>
+          <w:rFonts w:ascii="Times New Roman" w:hAnsi="Times New Roman"/>
+        </w:rPr>
+        <w:t>plaintext</w:t>
+      </w:r>
+      <w:proofErr w:type="gramEnd"/>
+      <w:r>
+        <w:rPr>
+          <w:rFonts w:ascii="Times New Roman" w:hAnsi="Times New Roman"/>
+        </w:rPr>
+        <w:t xml:space="preserve"> blocks:</w:t>
+      </w:r>
+    </w:p>
+    <w:p>
+      <w:pPr>
+        <w:spacing w:after="0"/>
+        <w:jc w:val="center"/>
+      </w:pPr>
+      <w:r>
+        <w:rPr>
+          <w:rFonts w:ascii="Times New Roman" w:hAnsi="Times New Roman"/>
+        </w:rPr>
+        <w:t>ctr0=1010    ctr1=1011    ctr2=1100</w:t>
+      </w:r>
+    </w:p>
+    <w:p>
+      <w:pPr>
+        <w:spacing w:after="0"/>
+      </w:pPr>
+      <w:r>
+        <w:rPr>
+          <w:rFonts w:ascii="Times New Roman" w:hAnsi="Times New Roman"/>
+        </w:rPr>
+        <w:t>CTR encryption XORs each plaintext block with the encrypted counter value:</w:t>
+      </w:r>
+    </w:p>
+    <w:p>
+      <w:pPr>
+        <w:spacing w:after="0"/>
+        <w:jc w:val="center"/>
+      </w:pPr>
+      <w:r>
+        <w:rPr>
+          <w:rFonts w:ascii="Times New Roman" w:hAnsi="Times New Roman"/>
+        </w:rPr>
+        <w:t>ci=mi XOR Ek(</w:t>
+      </w:r>
+      <w:proofErr w:type="spellStart"/>
+      <w:r>
+        <w:rPr>
+          <w:rFonts w:ascii="Times New Roman" w:hAnsi="Times New Roman"/>
+        </w:rPr>
+        <w:t>ctri</w:t>
+      </w:r>
+      <w:proofErr w:type="spellEnd"/>
+      <w:r>
+        <w:rPr>
+          <w:rFonts w:ascii="Times New Roman" w:hAnsi="Times New Roman"/>
+        </w:rPr>
+        <w:t>)</w:t>
+      </w:r>
+    </w:p>
+    <w:p>
+      <w:pPr>
+        <w:spacing w:after="0"/>
+      </w:pPr>
+      <w:r>
+        <w:rPr>
+          <w:rFonts w:ascii="Times New Roman" w:hAnsi="Times New Roman"/>
+        </w:rPr>
+        <w:t>Block 1:</w:t>
+      </w:r>
+    </w:p>
+    <w:p>
+      <w:pPr>
+        <w:spacing w:after="0"/>
+        <w:jc w:val="center"/>
+      </w:pPr>
+      <w:r>
+        <w:rPr>
+          <w:rFonts w:ascii="Times New Roman" w:hAnsi="Times New Roman"/>
+        </w:rPr>
+        <w:t>Ek(1010)=0110</w:t>
+      </w:r>
+    </w:p>
+    <w:p>
+      <w:pPr>
+        <w:spacing w:after="0"/>
+        <w:jc w:val="center"/>
+      </w:pPr>
+      <w:r>
+        <w:rPr>
+          <w:rFonts w:ascii="Times New Roman" w:hAnsi="Times New Roman"/>
+        </w:rPr>
+        <w:t>c1=0101 XOR 0110 = 0011=D</w:t>
+      </w:r>
+    </w:p>
+    <w:p>
+      <w:pPr>
+        <w:spacing w:after="0"/>
+      </w:pPr>
+      <w:r>
+        <w:rPr>
+          <w:rFonts w:ascii="Times New Roman" w:hAnsi="Times New Roman"/>
+        </w:rPr>
+        <w:t>Block 2:</w:t>
+      </w:r>
+    </w:p>
+    <w:p>
+      <w:pPr>
+        <w:spacing w:after="0"/>
+        <w:jc w:val="center"/>
+      </w:pPr>
+      <w:r>
+        <w:rPr>
+          <w:rFonts w:ascii="Times New Roman" w:hAnsi="Times New Roman"/>
+        </w:rPr>
+        <w:t>Ek(1011)=0111</w:t>
+      </w:r>
+    </w:p>
+    <w:p>
+      <w:pPr>
+        <w:spacing w:after="0"/>
+        <w:jc w:val="center"/>
+      </w:pPr>
+      <w:r>
+        <w:rPr>
+          <w:rFonts w:ascii="Times New Roman" w:hAnsi="Times New Roman"/>
+        </w:rPr>
+        <w:t>c2=1110 XOR 0111 = 1001=J</w:t>
+      </w:r>
+    </w:p>
+    <w:p>
+      <w:pPr>
+        <w:spacing w:after="0"/>
+      </w:pPr>
+      <w:r>
+        <w:rPr>
+          <w:rFonts w:ascii="Times New Roman" w:hAnsi="Times New Roman"/>
+        </w:rPr>
+        <w:t>Block 3:</w:t>
+      </w:r>
+    </w:p>
+    <w:p>
+      <w:pPr>
+        <w:spacing w:after="0"/>
+        <w:jc w:val="center"/>
+      </w:pPr>
+      <w:r>
+        <w:rPr>
+          <w:rFonts w:ascii="Times New Roman" w:hAnsi="Times New Roman"/>
+        </w:rPr>
+        <w:t>Ek(1100)=1010</w:t>
+      </w:r>
+    </w:p>
+    <w:p>
+      <w:pPr>
+        <w:spacing w:after="0"/>
+        <w:jc w:val="center"/>
+      </w:pPr>
+      <w:r>
+        <w:rPr>
+          <w:rFonts w:ascii="Times New Roman" w:hAnsi="Times New Roman"/>
+        </w:rPr>
+        <w:t>c3=1110 XOR 1010 = 0100=E</w:t>
+      </w:r>
+    </w:p>
+    <w:p>
+      <w:pPr>
+        <w:spacing w:after="0"/>
+      </w:pPr>
+      <w:r>
+        <w:rPr>
+          <w:rFonts w:ascii="Times New Roman" w:hAnsi="Times New Roman"/>
+        </w:rPr>
+        <w:t>Therefore:</w:t>
+      </w:r>
+    </w:p>
+    <w:p>
+      <w:pPr>
+        <w:spacing w:after="0"/>
+        <w:jc w:val="center"/>
+      </w:pPr>
+      <w:r>
+        <w:rPr>
+          <w:rFonts w:ascii="Times New Roman" w:hAnsi="Times New Roman"/>
+        </w:rPr>
+        <w:t>CTR encrypted data = 0011 1001 0100</w:t>
+      </w:r>
+    </w:p>
+    <w:p>
+      <w:pPr>
+        <w:spacing w:after="0"/>
+        <w:jc w:val="center"/>
+      </w:pPr>
+      <w:r>
+        <w:rPr>
+          <w:rFonts w:ascii="Times New Roman" w:hAnsi="Times New Roman"/>
+        </w:rPr>
+        <w:t>CTR ciphertext letters = DJE</w:t>
+      </w:r>
+    </w:p>
+    <w:p>
+      <w:pPr>
+        <w:spacing w:after="0"/>
+      </w:pPr>
+      <w:r>
+        <w:rPr>
+          <w:rFonts w:ascii="Times New Roman" w:hAnsi="Times New Roman"/>
+        </w:rPr>
+        <w:t>The class notes show the nonce/counter value sent together with the encrypted blocks. If the initial counter 1010 is included as a prefix, the full transmitted value is 1010 || 0011 || 1001 || 0100, displayed as K || DJE = KDJE.</w:t>
+      </w:r>
+    </w:p>
+    <w:p>
+      <w:pPr>
+        <w:spacing w:after="0"/>
+      </w:pPr>
+    </w:p>
+    <w:p>
+      <w:pPr>
+        <w:spacing w:after="0"/>
+      </w:pPr>
+      <w:r>
+        <w:rPr>
+          <w:rFonts w:ascii="Times New Roman" w:hAnsi="Times New Roman"/>
+        </w:rPr>
+        <w:lastRenderedPageBreak/>
+        <w:t>1.5 Task 3a – Decryption</w:t>
+      </w:r>
+    </w:p>
+    <w:p>
+      <w:pPr>
+        <w:spacing w:after="0"/>
+      </w:pPr>
+      <w:r>
+        <w:rPr>
+          <w:rFonts w:ascii="Times New Roman" w:hAnsi="Times New Roman"/>
+        </w:rPr>
+        <w:t>ECB Decryption</w:t>
+      </w:r>
+    </w:p>
+    <w:p>
+      <w:pPr>
+        <w:spacing w:after="0"/>
+      </w:pPr>
+      <w:r>
+        <w:rPr>
+          <w:rFonts w:ascii="Times New Roman" w:hAnsi="Times New Roman"/>
+        </w:rPr>
+        <w:t>ECB decrypts each ciphertext block independently using Dk(c1c2c3c4)=(c3c1c2c4).</w:t>
+      </w:r>
+    </w:p>
+    <w:p>
+      <w:pPr>
+        <w:spacing w:after="0"/>
+        <w:jc w:val="center"/>
+      </w:pPr>
+      <w:r>
+        <w:rPr>
+          <w:rFonts w:ascii="Times New Roman" w:hAnsi="Times New Roman"/>
+        </w:rPr>
+        <w:t>Dk(1001)=0101=F</w:t>
+      </w:r>
+    </w:p>
+    <w:p>
+      <w:pPr>
+        <w:spacing w:after="0"/>
+        <w:jc w:val="center"/>
+      </w:pPr>
+      <w:r>
+        <w:rPr>
+          <w:rFonts w:ascii="Times New Roman" w:hAnsi="Times New Roman"/>
+        </w:rPr>
+        <w:t>Dk(1110)=1110=O</w:t>
+      </w:r>
+    </w:p>
+    <w:p>
+      <w:pPr>
+        <w:spacing w:after="0"/>
+        <w:jc w:val="center"/>
+      </w:pPr>
+      <w:r>
+        <w:rPr>
+          <w:rFonts w:ascii="Times New Roman" w:hAnsi="Times New Roman"/>
+        </w:rPr>
+        <w:t>Dk(1110)=1110=O</w:t>
+      </w:r>
+    </w:p>
+    <w:p>
+      <w:pPr>
+        <w:spacing w:after="0"/>
+        <w:jc w:val="center"/>
+      </w:pPr>
+      <w:r>
+        <w:rPr>
+          <w:rFonts w:ascii="Times New Roman" w:hAnsi="Times New Roman"/>
+        </w:rPr>
+        <w:t>Recovered plaintext = FOO</w:t>
+      </w:r>
+    </w:p>
+    <w:p>
+      <w:pPr>
+        <w:spacing w:after="0"/>
+      </w:pPr>
+    </w:p>
+    <w:p>
+      <w:pPr>
+        <w:spacing w:after="0"/>
+      </w:pPr>
+      <w:r>
+        <w:rPr>
+          <w:rFonts w:ascii="Times New Roman" w:hAnsi="Times New Roman"/>
+        </w:rPr>
+        <w:t>CBC Decryption</w:t>
+      </w:r>
+    </w:p>
+    <w:p>
+      <w:pPr>
+        <w:spacing w:after="0"/>
+      </w:pPr>
+      <w:r>
+        <w:rPr>
+          <w:rFonts w:ascii="Times New Roman" w:hAnsi="Times New Roman"/>
+        </w:rPr>
+        <w:t>According to the class notes:</w:t>
+      </w:r>
+    </w:p>
+    <w:p>
+      <w:pPr>
+        <w:spacing w:after="0"/>
+        <w:jc w:val="center"/>
+      </w:pPr>
+      <w:r>
+        <w:rPr>
+          <w:rFonts w:ascii="Times New Roman" w:hAnsi="Times New Roman"/>
+        </w:rPr>
+        <w:t>mi=Dk(ci) XOR ci-1,    with c0=IV</w:t>
+      </w:r>
+    </w:p>
+    <w:p>
+      <w:pPr>
+        <w:spacing w:after="0"/>
+      </w:pPr>
+      <w:r>
+        <w:rPr>
+          <w:rFonts w:ascii="Times New Roman" w:hAnsi="Times New Roman"/>
+        </w:rPr>
+        <w:t>Block 1:</w:t>
+      </w:r>
+    </w:p>
+    <w:p>
+      <w:pPr>
+        <w:spacing w:after="0"/>
+        <w:jc w:val="center"/>
+      </w:pPr>
+      <w:r>
+        <w:rPr>
+          <w:rFonts w:ascii="Times New Roman" w:hAnsi="Times New Roman"/>
+        </w:rPr>
+        <w:t>Dk(1111)=1111</w:t>
+      </w:r>
+    </w:p>
+    <w:p>
+      <w:pPr>
+        <w:spacing w:after="0"/>
+        <w:jc w:val="center"/>
+      </w:pPr>
+      <w:r>
+        <w:rPr>
+          <w:rFonts w:ascii="Times New Roman" w:hAnsi="Times New Roman"/>
+        </w:rPr>
+        <w:t>m1=1111 XOR 1010 = 0101=F</w:t>
+      </w:r>
+    </w:p>
+    <w:p>
+      <w:pPr>
+        <w:spacing w:after="0"/>
+      </w:pPr>
+      <w:r>
+        <w:rPr>
+          <w:rFonts w:ascii="Times New Roman" w:hAnsi="Times New Roman"/>
+        </w:rPr>
+        <w:t>Block 2:</w:t>
+      </w:r>
+    </w:p>
+    <w:p>
+      <w:pPr>
+        <w:spacing w:after="0"/>
+        <w:jc w:val="center"/>
+      </w:pPr>
+      <w:r>
+        <w:rPr>
+          <w:rFonts w:ascii="Times New Roman" w:hAnsi="Times New Roman"/>
+        </w:rPr>
+        <w:t>Dk(0001)=0001</w:t>
+      </w:r>
+    </w:p>
+    <w:p>
+      <w:pPr>
+        <w:spacing w:after="0"/>
+        <w:jc w:val="center"/>
+      </w:pPr>
+      <w:r>
+        <w:rPr>
+          <w:rFonts w:ascii="Times New Roman" w:hAnsi="Times New Roman"/>
+        </w:rPr>
+        <w:t>m2=0001 XOR 1111 = 1110=O</w:t>
+      </w:r>
+    </w:p>
+    <w:p>
+      <w:pPr>
+        <w:spacing w:after="0"/>
+      </w:pPr>
+      <w:r>
+        <w:rPr>
+          <w:rFonts w:ascii="Times New Roman" w:hAnsi="Times New Roman"/>
+        </w:rPr>
+        <w:t>Block 3:</w:t>
+      </w:r>
+    </w:p>
+    <w:p>
+      <w:pPr>
+        <w:spacing w:after="0"/>
+        <w:jc w:val="center"/>
+      </w:pPr>
+      <w:r>
+        <w:rPr>
+          <w:rFonts w:ascii="Times New Roman" w:hAnsi="Times New Roman"/>
+        </w:rPr>
+        <w:t>Dk(1111)=1111</w:t>
+      </w:r>
+    </w:p>
+    <w:p>
+      <w:pPr>
+        <w:spacing w:after="0"/>
+        <w:jc w:val="center"/>
+      </w:pPr>
+      <w:r>
+        <w:rPr>
+          <w:rFonts w:ascii="Times New Roman" w:hAnsi="Times New Roman"/>
+        </w:rPr>
+        <w:t>m3=1111 XOR 0001 = 1110=O</w:t>
+      </w:r>
+    </w:p>
+    <w:p>
+      <w:pPr>
+        <w:spacing w:after="0"/>
+        <w:jc w:val="center"/>
+      </w:pPr>
+      <w:r>
+        <w:rPr>
+          <w:rFonts w:ascii="Times New Roman" w:hAnsi="Times New Roman"/>
+        </w:rPr>
+        <w:t>Recovered plaintext = FOO</w:t>
+      </w:r>
+    </w:p>
+    <w:p>
+      <w:pPr>
+        <w:spacing w:after="0"/>
+      </w:pPr>
+    </w:p>
+    <w:p>
+      <w:pPr>
+        <w:spacing w:after="0"/>
+      </w:pPr>
+      <w:r>
+        <w:rPr>
+          <w:rFonts w:ascii="Times New Roman" w:hAnsi="Times New Roman"/>
+        </w:rPr>
+        <w:t>CTR Decryption</w:t>
+      </w:r>
+    </w:p>
+    <w:p>
+      <w:pPr>
+        <w:spacing w:after="0"/>
+      </w:pPr>
+      <w:r>
+        <w:rPr>
+          <w:rFonts w:ascii="Times New Roman" w:hAnsi="Times New Roman"/>
+        </w:rPr>
+        <w:t>CTR decryption uses the same encrypted counter values as encryption and XORs them with the ciphertext blocks:</w:t>
+      </w:r>
+    </w:p>
+    <w:p>
+      <w:pPr>
+        <w:spacing w:after="0"/>
+        <w:jc w:val="center"/>
+      </w:pPr>
+      <w:r>
+        <w:rPr>
+          <w:rFonts w:ascii="Times New Roman" w:hAnsi="Times New Roman"/>
+        </w:rPr>
+        <w:t>mi=ci XOR Ek(</w:t>
+      </w:r>
+      <w:proofErr w:type="spellStart"/>
+      <w:r>
+        <w:rPr>
+          <w:rFonts w:ascii="Times New Roman" w:hAnsi="Times New Roman"/>
+        </w:rPr>
+        <w:t>ctri</w:t>
+      </w:r>
+      <w:proofErr w:type="spellEnd"/>
+      <w:r>
+        <w:rPr>
+          <w:rFonts w:ascii="Times New Roman" w:hAnsi="Times New Roman"/>
+        </w:rPr>
+        <w:t>)</w:t>
+      </w:r>
+    </w:p>
+    <w:p>
+      <w:pPr>
+        <w:spacing w:after="0"/>
+        <w:jc w:val="center"/>
+      </w:pPr>
+      <w:r>
+        <w:rPr>
+          <w:rFonts w:ascii="Times New Roman" w:hAnsi="Times New Roman"/>
+        </w:rPr>
+        <w:t>m1=0011 XOR 0110 = 0101=F</w:t>
+      </w:r>
+    </w:p>
+    <w:p>
+      <w:pPr>
+        <w:spacing w:after="0"/>
+        <w:jc w:val="center"/>
+      </w:pPr>
+      <w:r>
+        <w:rPr>
+          <w:rFonts w:ascii="Times New Roman" w:hAnsi="Times New Roman"/>
+        </w:rPr>
+        <w:t>m2=1001 XOR 0111 = 1110=O</w:t>
+      </w:r>
+    </w:p>
+    <w:p>
+      <w:pPr>
+        <w:spacing w:after="0"/>
+        <w:jc w:val="center"/>
+      </w:pPr>
+      <w:r>
+        <w:rPr>
+          <w:rFonts w:ascii="Times New Roman" w:hAnsi="Times New Roman"/>
+        </w:rPr>
+        <w:t>m3=0100 XOR 1010 = 1110=O</w:t>
+      </w:r>
+    </w:p>
+    <w:p>
+      <w:pPr>
+        <w:spacing w:after="0"/>
+        <w:jc w:val="center"/>
+      </w:pPr>
+      <w:r>
+        <w:rPr>
+          <w:rFonts w:ascii="Times New Roman" w:hAnsi="Times New Roman"/>
+        </w:rPr>
+        <w:t>Recovered plaintext = FOO</w:t>
+      </w:r>
+    </w:p>
+    <w:p>
+      <w:pPr>
+        <w:spacing w:after="0"/>
+      </w:pPr>
+    </w:p>
+    <w:p>
+      <w:pPr>
+        <w:spacing w:after="0"/>
+      </w:pPr>
+      <w:r>
+        <w:rPr>
+          <w:rFonts w:ascii="Times New Roman" w:hAnsi="Times New Roman"/>
+        </w:rPr>
+        <w:t>1.6 Final Results</w:t>
+      </w:r>
+    </w:p>
+    <w:p>
+      <w:pPr>
+        <w:spacing w:after="0"/>
+        <w:jc w:val="center"/>
+      </w:pPr>
+      <w:r>
+        <w:rPr>
+          <w:rFonts w:ascii="Times New Roman" w:hAnsi="Times New Roman"/>
+        </w:rPr>
+        <w:t>ECB:  JOO  -&gt;  FOO</w:t>
+      </w:r>
+    </w:p>
+    <w:p>
+      <w:pPr>
+        <w:spacing w:after="0"/>
+        <w:jc w:val="center"/>
+      </w:pPr>
+      <w:r>
+        <w:rPr>
+          <w:rFonts w:ascii="Times New Roman" w:hAnsi="Times New Roman"/>
+        </w:rPr>
+        <w:t>CBC:  PBP  -&gt;  FOO</w:t>
+      </w:r>
+    </w:p>
+    <w:p>
+      <w:pPr>
+        <w:spacing w:after="0"/>
+        <w:jc w:val="center"/>
+      </w:pPr>
+      <w:r>
+        <w:rPr>
+          <w:rFonts w:ascii="Times New Roman" w:hAnsi="Times New Roman"/>
+        </w:rPr>
+        <w:t>CTR:  DJE  -&gt;  FOO</w:t>
+      </w:r>
+    </w:p>
+    <w:p>
+      <w:pPr>
+        <w:spacing w:after="0"/>
+      </w:pPr>
+      <w:r>
+        <w:rPr>
+          <w:rFonts w:ascii="Times New Roman" w:hAnsi="Times New Roman"/>
+        </w:rPr>
+        <w:t>All three decryption procedures recover the original plaintext FOO. The calculations follow the ECB, CBC, and CTR definitions and counter progression shown in PPT-ModesOps-v2026B.</w:t>
+      </w:r>
+    </w:p>
+    <w:p>
+      <w:pPr>
+        <w:spacing w:after="0"/>
         <w:rPr>
           <w:rFonts w:ascii="Times New Roman" w:hAnsi="Times New Roman" w:cs="Times New Roman"/>
           <w:b/>
@@ -60,7 +1271,10 @@
           <w:szCs w:val="28"/>
         </w:rPr>
       </w:pPr>
-      <w:r>
+    </w:p>
+    <w:p>
+      <w:pPr>
+        <w:spacing w:after="0"/>
         <w:rPr>
           <w:rFonts w:ascii="Times New Roman" w:hAnsi="Times New Roman" w:cs="Times New Roman"/>
           <w:b/>
@@ -68,6 +1282,28 @@
           <w:sz w:val="28"/>
           <w:szCs w:val="28"/>
         </w:rPr>
+      </w:pPr>
+    </w:p>
+    <w:p>
+      <w:pPr>
+        <w:spacing w:after="0"/>
+        <w:rPr>
+          <w:rFonts w:ascii="Times New Roman" w:hAnsi="Times New Roman" w:cs="Times New Roman"/>
+          <w:b/>
+          <w:bCs/>
+          <w:sz w:val="28"/>
+          <w:szCs w:val="28"/>
+        </w:rPr>
+      </w:pPr>
+      <w:r>
+        <w:rPr>
+          <w:rFonts w:ascii="Times New Roman" w:hAnsi="Times New Roman" w:cs="Times New Roman"/>
+          <w:b/>
+          <w:bCs/>
+          <w:sz w:val="28"/>
+          <w:szCs w:val="28"/>
+        </w:rPr>
+        <w:lastRenderedPageBreak/>
         <w:t>Problem 2- Mini Block Cipher</w:t>
       </w:r>
     </w:p>
@@ -96,21 +1332,77 @@
         <w:rPr>
           <w:rFonts w:ascii="Times New Roman" w:hAnsi="Times New Roman" w:cs="Times New Roman"/>
         </w:rPr>
-        <w:t>The plaintext and key are both 16 bits. The cipher uses a 4-bit S-box, key expansion, ShiftRows, MixColumns, and AddRoundKey.</w:t>
-      </w:r>
-    </w:p>
-    <w:p>
-      <w:pPr>
-        <w:spacing w:after="0"/>
-        <w:rPr>
-          <w:rFonts w:ascii="Times New Roman" w:hAnsi="Times New Roman" w:cs="Times New Roman"/>
-        </w:rPr>
-      </w:pPr>
-      <w:r>
-        <w:rPr>
-          <w:rFonts w:ascii="Times New Roman" w:hAnsi="Times New Roman" w:cs="Times New Roman"/>
-        </w:rPr>
-        <w:t>For this assignment, the initial AddRoundKey operation using the original key is removed.</w:t>
+        <w:t xml:space="preserve">The plaintext and key are both 16 bits. The cipher uses a 4-bit S-box, key expansion, </w:t>
+      </w:r>
+      <w:proofErr w:type="spellStart"/>
+      <w:r>
+        <w:rPr>
+          <w:rFonts w:ascii="Times New Roman" w:hAnsi="Times New Roman" w:cs="Times New Roman"/>
+        </w:rPr>
+        <w:t>ShiftRows</w:t>
+      </w:r>
+      <w:proofErr w:type="spellEnd"/>
+      <w:r>
+        <w:rPr>
+          <w:rFonts w:ascii="Times New Roman" w:hAnsi="Times New Roman" w:cs="Times New Roman"/>
+        </w:rPr>
+        <w:t xml:space="preserve">, </w:t>
+      </w:r>
+      <w:proofErr w:type="spellStart"/>
+      <w:r>
+        <w:rPr>
+          <w:rFonts w:ascii="Times New Roman" w:hAnsi="Times New Roman" w:cs="Times New Roman"/>
+        </w:rPr>
+        <w:t>MixColumns</w:t>
+      </w:r>
+      <w:proofErr w:type="spellEnd"/>
+      <w:r>
+        <w:rPr>
+          <w:rFonts w:ascii="Times New Roman" w:hAnsi="Times New Roman" w:cs="Times New Roman"/>
+        </w:rPr>
+        <w:t xml:space="preserve">, and </w:t>
+      </w:r>
+      <w:proofErr w:type="spellStart"/>
+      <w:r>
+        <w:rPr>
+          <w:rFonts w:ascii="Times New Roman" w:hAnsi="Times New Roman" w:cs="Times New Roman"/>
+        </w:rPr>
+        <w:t>AddRoundKey</w:t>
+      </w:r>
+      <w:proofErr w:type="spellEnd"/>
+      <w:r>
+        <w:rPr>
+          <w:rFonts w:ascii="Times New Roman" w:hAnsi="Times New Roman" w:cs="Times New Roman"/>
+        </w:rPr>
+        <w:t>.</w:t>
+      </w:r>
+    </w:p>
+    <w:p>
+      <w:pPr>
+        <w:spacing w:after="0"/>
+        <w:rPr>
+          <w:rFonts w:ascii="Times New Roman" w:hAnsi="Times New Roman" w:cs="Times New Roman"/>
+        </w:rPr>
+      </w:pPr>
+      <w:r>
+        <w:rPr>
+          <w:rFonts w:ascii="Times New Roman" w:hAnsi="Times New Roman" w:cs="Times New Roman"/>
+        </w:rPr>
+        <w:t xml:space="preserve">For this assignment, the initial </w:t>
+      </w:r>
+      <w:proofErr w:type="spellStart"/>
+      <w:r>
+        <w:rPr>
+          <w:rFonts w:ascii="Times New Roman" w:hAnsi="Times New Roman" w:cs="Times New Roman"/>
+        </w:rPr>
+        <w:t>AddRoundKey</w:t>
+      </w:r>
+      <w:proofErr w:type="spellEnd"/>
+      <w:r>
+        <w:rPr>
+          <w:rFonts w:ascii="Times New Roman" w:hAnsi="Times New Roman" w:cs="Times New Roman"/>
+        </w:rPr>
+        <w:t xml:space="preserve"> operation using the original key is removed.</w:t>
       </w:r>
     </w:p>
     <w:p>
@@ -519,12 +1811,14 @@
           <w:rFonts w:ascii="Times New Roman" w:hAnsi="Times New Roman" w:cs="Times New Roman"/>
         </w:rPr>
       </w:pPr>
+      <w:proofErr w:type="spellStart"/>
       <w:r>
         <w:rPr>
           <w:rFonts w:ascii="Times New Roman" w:hAnsi="Times New Roman" w:cs="Times New Roman"/>
         </w:rPr>
         <w:t>ShiftRows</w:t>
       </w:r>
+      <w:proofErr w:type="spellEnd"/>
     </w:p>
     <w:p>
       <w:pPr>
@@ -537,12 +1831,14 @@
           <w:rFonts w:ascii="Times New Roman" w:hAnsi="Times New Roman" w:cs="Times New Roman"/>
         </w:rPr>
       </w:pPr>
+      <w:proofErr w:type="spellStart"/>
       <w:r>
         <w:rPr>
           <w:rFonts w:ascii="Times New Roman" w:hAnsi="Times New Roman" w:cs="Times New Roman"/>
         </w:rPr>
         <w:t>MixColumns</w:t>
       </w:r>
+      <w:proofErr w:type="spellEnd"/>
     </w:p>
     <w:p>
       <w:pPr>
@@ -555,12 +1851,14 @@
           <w:rFonts w:ascii="Times New Roman" w:hAnsi="Times New Roman" w:cs="Times New Roman"/>
         </w:rPr>
       </w:pPr>
+      <w:proofErr w:type="spellStart"/>
       <w:r>
         <w:rPr>
           <w:rFonts w:ascii="Times New Roman" w:hAnsi="Times New Roman" w:cs="Times New Roman"/>
         </w:rPr>
         <w:t>AddRoundKey</w:t>
       </w:r>
+      <w:proofErr w:type="spellEnd"/>
     </w:p>
     <w:p>
       <w:pPr>
@@ -605,12 +1903,14 @@
           <w:rFonts w:ascii="Times New Roman" w:hAnsi="Times New Roman" w:cs="Times New Roman"/>
         </w:rPr>
       </w:pPr>
+      <w:proofErr w:type="spellStart"/>
       <w:r>
         <w:rPr>
           <w:rFonts w:ascii="Times New Roman" w:hAnsi="Times New Roman" w:cs="Times New Roman"/>
         </w:rPr>
         <w:t>ShiftRows</w:t>
       </w:r>
+      <w:proofErr w:type="spellEnd"/>
     </w:p>
     <w:p>
       <w:pPr>
@@ -623,25 +1923,41 @@
           <w:rFonts w:ascii="Times New Roman" w:hAnsi="Times New Roman" w:cs="Times New Roman"/>
         </w:rPr>
       </w:pPr>
+      <w:proofErr w:type="spellStart"/>
       <w:r>
         <w:rPr>
           <w:rFonts w:ascii="Times New Roman" w:hAnsi="Times New Roman" w:cs="Times New Roman"/>
         </w:rPr>
         <w:t>AddRoundKey</w:t>
       </w:r>
-    </w:p>
-    <w:p>
-      <w:pPr>
-        <w:spacing w:after="0"/>
-        <w:rPr>
-          <w:rFonts w:ascii="Times New Roman" w:hAnsi="Times New Roman" w:cs="Times New Roman"/>
-        </w:rPr>
-      </w:pPr>
-      <w:r>
-        <w:rPr>
-          <w:rFonts w:ascii="Times New Roman" w:hAnsi="Times New Roman" w:cs="Times New Roman"/>
-        </w:rPr>
-        <w:t>The initial AddRoundKey using K0 is omitted.</w:t>
+      <w:proofErr w:type="spellEnd"/>
+    </w:p>
+    <w:p>
+      <w:pPr>
+        <w:spacing w:after="0"/>
+        <w:rPr>
+          <w:rFonts w:ascii="Times New Roman" w:hAnsi="Times New Roman" w:cs="Times New Roman"/>
+        </w:rPr>
+      </w:pPr>
+      <w:r>
+        <w:rPr>
+          <w:rFonts w:ascii="Times New Roman" w:hAnsi="Times New Roman" w:cs="Times New Roman"/>
+        </w:rPr>
+        <w:t xml:space="preserve">The initial </w:t>
+      </w:r>
+      <w:proofErr w:type="spellStart"/>
+      <w:r>
+        <w:rPr>
+          <w:rFonts w:ascii="Times New Roman" w:hAnsi="Times New Roman" w:cs="Times New Roman"/>
+        </w:rPr>
+        <w:t>AddRoundKey</w:t>
+      </w:r>
+      <w:proofErr w:type="spellEnd"/>
+      <w:r>
+        <w:rPr>
+          <w:rFonts w:ascii="Times New Roman" w:hAnsi="Times New Roman" w:cs="Times New Roman"/>
+        </w:rPr>
+        <w:t xml:space="preserve"> using K0 is omitted.</w:t>
       </w:r>
     </w:p>
     <w:p>
@@ -669,66 +1985,114 @@
         <w:rPr>
           <w:rFonts w:ascii="Times New Roman" w:hAnsi="Times New Roman" w:cs="Times New Roman"/>
         </w:rPr>
+        <w:t xml:space="preserve">The lecture describes the underlying SAES construction using substitution, </w:t>
+      </w:r>
+      <w:proofErr w:type="spellStart"/>
+      <w:r>
+        <w:rPr>
+          <w:rFonts w:ascii="Times New Roman" w:hAnsi="Times New Roman" w:cs="Times New Roman"/>
+        </w:rPr>
+        <w:t>ShiftRows</w:t>
+      </w:r>
+      <w:proofErr w:type="spellEnd"/>
+      <w:r>
+        <w:rPr>
+          <w:rFonts w:ascii="Times New Roman" w:hAnsi="Times New Roman" w:cs="Times New Roman"/>
+        </w:rPr>
+        <w:t xml:space="preserve">, </w:t>
+      </w:r>
+      <w:proofErr w:type="spellStart"/>
+      <w:r>
+        <w:rPr>
+          <w:rFonts w:ascii="Times New Roman" w:hAnsi="Times New Roman" w:cs="Times New Roman"/>
+        </w:rPr>
+        <w:t>MixColumns</w:t>
+      </w:r>
+      <w:proofErr w:type="spellEnd"/>
+      <w:r>
+        <w:rPr>
+          <w:rFonts w:ascii="Times New Roman" w:hAnsi="Times New Roman" w:cs="Times New Roman"/>
+        </w:rPr>
+        <w:t xml:space="preserve">, and </w:t>
+      </w:r>
+      <w:proofErr w:type="spellStart"/>
+      <w:r>
+        <w:rPr>
+          <w:rFonts w:ascii="Times New Roman" w:hAnsi="Times New Roman" w:cs="Times New Roman"/>
+        </w:rPr>
+        <w:t>AddRoundKey</w:t>
+      </w:r>
+      <w:proofErr w:type="spellEnd"/>
+      <w:r>
+        <w:rPr>
+          <w:rFonts w:ascii="Times New Roman" w:hAnsi="Times New Roman" w:cs="Times New Roman"/>
+        </w:rPr>
+        <w:t xml:space="preserve"> operations. PPT-BlockCiphers-v2026B</w:t>
+      </w:r>
+    </w:p>
+    <w:p>
+      <w:pPr>
+        <w:spacing w:after="0"/>
+        <w:rPr>
+          <w:rFonts w:ascii="Times New Roman" w:hAnsi="Times New Roman" w:cs="Times New Roman"/>
+        </w:rPr>
+      </w:pPr>
+      <w:r>
+        <w:rPr>
+          <w:rFonts w:ascii="Times New Roman" w:hAnsi="Times New Roman" w:cs="Times New Roman"/>
+        </w:rPr>
+        <w:t>For the test plaintext:</w:t>
+      </w:r>
+    </w:p>
+    <w:p>
+      <w:pPr>
+        <w:spacing w:after="0"/>
+        <w:jc w:val="center"/>
+        <w:rPr>
+          <w:rFonts w:ascii="Times New Roman" w:hAnsi="Times New Roman" w:cs="Times New Roman"/>
+        </w:rPr>
+      </w:pPr>
+      <w:r>
+        <w:rPr>
+          <w:rFonts w:ascii="Times New Roman" w:hAnsi="Times New Roman" w:cs="Times New Roman"/>
+        </w:rPr>
+        <w:t>P=0101101001000011</w:t>
+      </w:r>
+    </w:p>
+    <w:p>
+      <w:pPr>
+        <w:spacing w:after="0"/>
+        <w:rPr>
+          <w:rFonts w:ascii="Times New Roman" w:hAnsi="Times New Roman" w:cs="Times New Roman"/>
+        </w:rPr>
+      </w:pPr>
+      <w:r>
+        <w:rPr>
+          <w:rFonts w:ascii="Times New Roman" w:hAnsi="Times New Roman" w:cs="Times New Roman"/>
+        </w:rPr>
+        <w:t>the implementation produced:</w:t>
+      </w:r>
+    </w:p>
+    <w:p>
+      <w:pPr>
+        <w:spacing w:after="0"/>
+        <w:jc w:val="center"/>
+        <w:rPr>
+          <w:rFonts w:ascii="Times New Roman" w:hAnsi="Times New Roman" w:cs="Times New Roman"/>
+        </w:rPr>
+      </w:pPr>
+      <w:r>
+        <w:rPr>
+          <w:rFonts w:ascii="Times New Roman" w:hAnsi="Times New Roman" w:cs="Times New Roman"/>
+        </w:rPr>
         <w:lastRenderedPageBreak/>
-        <w:t>The lecture describes the underlying SAES construction using substitution, ShiftRows, MixColumns, and AddRoundKey operations. PPT-BlockCiphers-v2026B</w:t>
-      </w:r>
-    </w:p>
-    <w:p>
-      <w:pPr>
-        <w:spacing w:after="0"/>
-        <w:rPr>
-          <w:rFonts w:ascii="Times New Roman" w:hAnsi="Times New Roman" w:cs="Times New Roman"/>
-        </w:rPr>
-      </w:pPr>
-      <w:r>
-        <w:rPr>
-          <w:rFonts w:ascii="Times New Roman" w:hAnsi="Times New Roman" w:cs="Times New Roman"/>
-        </w:rPr>
-        <w:t>For the test plaintext:</w:t>
-      </w:r>
-    </w:p>
-    <w:p>
-      <w:pPr>
-        <w:spacing w:after="0"/>
-        <w:jc w:val="center"/>
-        <w:rPr>
-          <w:rFonts w:ascii="Times New Roman" w:hAnsi="Times New Roman" w:cs="Times New Roman"/>
-        </w:rPr>
-      </w:pPr>
-      <w:r>
-        <w:rPr>
-          <w:rFonts w:ascii="Times New Roman" w:hAnsi="Times New Roman" w:cs="Times New Roman"/>
-        </w:rPr>
-        <w:t>P=0101101001000011</w:t>
-      </w:r>
-    </w:p>
-    <w:p>
-      <w:pPr>
-        <w:spacing w:after="0"/>
-        <w:rPr>
-          <w:rFonts w:ascii="Times New Roman" w:hAnsi="Times New Roman" w:cs="Times New Roman"/>
-        </w:rPr>
-      </w:pPr>
-      <w:r>
-        <w:rPr>
-          <w:rFonts w:ascii="Times New Roman" w:hAnsi="Times New Roman" w:cs="Times New Roman"/>
-        </w:rPr>
-        <w:t>the implementation produced:</w:t>
-      </w:r>
-    </w:p>
-    <w:p>
-      <w:pPr>
-        <w:spacing w:after="0"/>
-        <w:jc w:val="center"/>
-        <w:rPr>
-          <w:rFonts w:ascii="Times New Roman" w:hAnsi="Times New Roman" w:cs="Times New Roman"/>
-        </w:rPr>
-      </w:pPr>
-      <w:r>
-        <w:rPr>
-          <w:rFonts w:ascii="Times New Roman" w:hAnsi="Times New Roman" w:cs="Times New Roman"/>
-        </w:rPr>
         <w:t>C=100000000111111</w:t>
+      </w:r>
+      <w:r>
+        <w:rPr>
+          <w:rFonts w:ascii="Times New Roman" w:hAnsi="Times New Roman" w:cs="Times New Roman"/>
+        </w:rPr>
+        <w:t>1</w:t>
       </w:r>
     </w:p>
     <w:p>
@@ -1783,7 +3147,6 @@
         <w:rPr>
           <w:rFonts w:ascii="Times New Roman" w:hAnsi="Times New Roman" w:cs="Times New Roman"/>
         </w:rPr>
-        <w:lastRenderedPageBreak/>
         <w:t>the corresponding (K1,K2) pair becomes a candidate.</w:t>
       </w:r>
     </w:p>
@@ -1856,7 +3219,26 @@
         <w:rPr>
           <w:rFonts w:ascii="Times New Roman" w:hAnsi="Times New Roman" w:cs="Times New Roman"/>
         </w:rPr>
-        <w:t>boxed{65,536</w:t>
+        <w:lastRenderedPageBreak/>
+        <w:t>B</w:t>
+      </w:r>
+      <w:r>
+        <w:rPr>
+          <w:rFonts w:ascii="Times New Roman" w:hAnsi="Times New Roman" w:cs="Times New Roman"/>
+        </w:rPr>
+        <w:t>oxed</w:t>
+      </w:r>
+      <w:r>
+        <w:rPr>
+          <w:rFonts w:ascii="Times New Roman" w:hAnsi="Times New Roman" w:cs="Times New Roman"/>
+        </w:rPr>
+        <w:t xml:space="preserve"> </w:t>
+      </w:r>
+      <w:r>
+        <w:rPr>
+          <w:rFonts w:ascii="Times New Roman" w:hAnsi="Times New Roman" w:cs="Times New Roman"/>
+        </w:rPr>
+        <w:t>65,536</w:t>
       </w:r>
       <w:r>
         <w:rPr>
@@ -2761,115 +4143,115 @@
         <w:rPr>
           <w:rFonts w:ascii="Times New Roman" w:hAnsi="Times New Roman" w:cs="Times New Roman"/>
         </w:rPr>
+        <w:t>2^</w:t>
+      </w:r>
+      <w:r>
+        <w:rPr>
+          <w:rFonts w:ascii="Times New Roman" w:hAnsi="Times New Roman" w:cs="Times New Roman"/>
+        </w:rPr>
+        <w:t>(</w:t>
+      </w:r>
+      <w:r>
+        <w:rPr>
+          <w:rFonts w:ascii="Times New Roman" w:hAnsi="Times New Roman" w:cs="Times New Roman"/>
+        </w:rPr>
+        <w:t>1</w:t>
+      </w:r>
+      <w:r>
+        <w:rPr>
+          <w:rFonts w:ascii="Times New Roman" w:hAnsi="Times New Roman" w:cs="Times New Roman"/>
+        </w:rPr>
+        <w:t>6)</w:t>
+      </w:r>
+    </w:p>
+    <w:p>
+      <w:pPr>
+        <w:spacing w:after="0"/>
+        <w:rPr>
+          <w:rFonts w:ascii="Times New Roman" w:hAnsi="Times New Roman" w:cs="Times New Roman"/>
+        </w:rPr>
+      </w:pPr>
+      <w:r>
+        <w:rPr>
+          <w:rFonts w:ascii="Times New Roman" w:hAnsi="Times New Roman" w:cs="Times New Roman"/>
+        </w:rPr>
+        <w:t>possible K1 values and:</w:t>
+      </w:r>
+    </w:p>
+    <w:p>
+      <w:pPr>
+        <w:spacing w:after="0"/>
+        <w:jc w:val="center"/>
+        <w:rPr>
+          <w:rFonts w:ascii="Times New Roman" w:hAnsi="Times New Roman" w:cs="Times New Roman"/>
+        </w:rPr>
+      </w:pPr>
+      <w:r>
+        <w:rPr>
+          <w:rFonts w:ascii="Times New Roman" w:hAnsi="Times New Roman" w:cs="Times New Roman"/>
+        </w:rPr>
+        <w:t>2^</w:t>
+      </w:r>
+      <w:r>
+        <w:rPr>
+          <w:rFonts w:ascii="Times New Roman" w:hAnsi="Times New Roman" w:cs="Times New Roman"/>
+        </w:rPr>
+        <w:t>(</w:t>
+      </w:r>
+      <w:r>
+        <w:rPr>
+          <w:rFonts w:ascii="Times New Roman" w:hAnsi="Times New Roman" w:cs="Times New Roman"/>
+        </w:rPr>
+        <w:t>16</w:t>
+      </w:r>
+      <w:r>
+        <w:rPr>
+          <w:rFonts w:ascii="Times New Roman" w:hAnsi="Times New Roman" w:cs="Times New Roman"/>
+        </w:rPr>
+        <w:t>)</w:t>
+      </w:r>
+    </w:p>
+    <w:p>
+      <w:pPr>
+        <w:spacing w:after="0"/>
+        <w:rPr>
+          <w:rFonts w:ascii="Times New Roman" w:hAnsi="Times New Roman" w:cs="Times New Roman"/>
+        </w:rPr>
+      </w:pPr>
+      <w:r>
+        <w:rPr>
+          <w:rFonts w:ascii="Times New Roman" w:hAnsi="Times New Roman" w:cs="Times New Roman"/>
+        </w:rPr>
+        <w:t>possible K2 values.</w:t>
+      </w:r>
+    </w:p>
+    <w:p>
+      <w:pPr>
+        <w:spacing w:after="0"/>
+        <w:rPr>
+          <w:rFonts w:ascii="Times New Roman" w:hAnsi="Times New Roman" w:cs="Times New Roman"/>
+        </w:rPr>
+      </w:pPr>
+      <w:r>
+        <w:rPr>
+          <w:rFonts w:ascii="Times New Roman" w:hAnsi="Times New Roman" w:cs="Times New Roman"/>
+        </w:rPr>
+        <w:t>Therefore:</w:t>
+      </w:r>
+    </w:p>
+    <w:p>
+      <w:pPr>
+        <w:spacing w:after="0"/>
+        <w:jc w:val="center"/>
+        <w:rPr>
+          <w:rFonts w:ascii="Times New Roman" w:hAnsi="Times New Roman" w:cs="Times New Roman"/>
+        </w:rPr>
+      </w:pPr>
+      <w:r>
+        <w:rPr>
+          <w:rFonts w:ascii="Times New Roman" w:hAnsi="Times New Roman" w:cs="Times New Roman"/>
+        </w:rPr>
         <w:lastRenderedPageBreak/>
-        <w:t>2^</w:t>
-      </w:r>
-      <w:r>
-        <w:rPr>
-          <w:rFonts w:ascii="Times New Roman" w:hAnsi="Times New Roman" w:cs="Times New Roman"/>
-        </w:rPr>
-        <w:t>(</w:t>
-      </w:r>
-      <w:r>
-        <w:rPr>
-          <w:rFonts w:ascii="Times New Roman" w:hAnsi="Times New Roman" w:cs="Times New Roman"/>
-        </w:rPr>
-        <w:t>1</w:t>
-      </w:r>
-      <w:r>
-        <w:rPr>
-          <w:rFonts w:ascii="Times New Roman" w:hAnsi="Times New Roman" w:cs="Times New Roman"/>
-        </w:rPr>
-        <w:t>6)</w:t>
-      </w:r>
-    </w:p>
-    <w:p>
-      <w:pPr>
-        <w:spacing w:after="0"/>
-        <w:rPr>
-          <w:rFonts w:ascii="Times New Roman" w:hAnsi="Times New Roman" w:cs="Times New Roman"/>
-        </w:rPr>
-      </w:pPr>
-      <w:r>
-        <w:rPr>
-          <w:rFonts w:ascii="Times New Roman" w:hAnsi="Times New Roman" w:cs="Times New Roman"/>
-        </w:rPr>
-        <w:t>possible K1 values and:</w:t>
-      </w:r>
-    </w:p>
-    <w:p>
-      <w:pPr>
-        <w:spacing w:after="0"/>
-        <w:jc w:val="center"/>
-        <w:rPr>
-          <w:rFonts w:ascii="Times New Roman" w:hAnsi="Times New Roman" w:cs="Times New Roman"/>
-        </w:rPr>
-      </w:pPr>
-      <w:r>
-        <w:rPr>
-          <w:rFonts w:ascii="Times New Roman" w:hAnsi="Times New Roman" w:cs="Times New Roman"/>
-        </w:rPr>
-        <w:t>2^</w:t>
-      </w:r>
-      <w:r>
-        <w:rPr>
-          <w:rFonts w:ascii="Times New Roman" w:hAnsi="Times New Roman" w:cs="Times New Roman"/>
-        </w:rPr>
-        <w:t>(</w:t>
-      </w:r>
-      <w:r>
-        <w:rPr>
-          <w:rFonts w:ascii="Times New Roman" w:hAnsi="Times New Roman" w:cs="Times New Roman"/>
-        </w:rPr>
-        <w:t>16</w:t>
-      </w:r>
-      <w:r>
-        <w:rPr>
-          <w:rFonts w:ascii="Times New Roman" w:hAnsi="Times New Roman" w:cs="Times New Roman"/>
-        </w:rPr>
-        <w:t>)</w:t>
-      </w:r>
-    </w:p>
-    <w:p>
-      <w:pPr>
-        <w:spacing w:after="0"/>
-        <w:rPr>
-          <w:rFonts w:ascii="Times New Roman" w:hAnsi="Times New Roman" w:cs="Times New Roman"/>
-        </w:rPr>
-      </w:pPr>
-      <w:r>
-        <w:rPr>
-          <w:rFonts w:ascii="Times New Roman" w:hAnsi="Times New Roman" w:cs="Times New Roman"/>
-        </w:rPr>
-        <w:t>possible K2 values.</w:t>
-      </w:r>
-    </w:p>
-    <w:p>
-      <w:pPr>
-        <w:spacing w:after="0"/>
-        <w:rPr>
-          <w:rFonts w:ascii="Times New Roman" w:hAnsi="Times New Roman" w:cs="Times New Roman"/>
-        </w:rPr>
-      </w:pPr>
-      <w:r>
-        <w:rPr>
-          <w:rFonts w:ascii="Times New Roman" w:hAnsi="Times New Roman" w:cs="Times New Roman"/>
-        </w:rPr>
-        <w:t>Therefore:</w:t>
-      </w:r>
-    </w:p>
-    <w:p>
-      <w:pPr>
-        <w:spacing w:after="0"/>
-        <w:jc w:val="center"/>
-        <w:rPr>
-          <w:rFonts w:ascii="Times New Roman" w:hAnsi="Times New Roman" w:cs="Times New Roman"/>
-        </w:rPr>
-      </w:pPr>
-      <w:r>
-        <w:rPr>
-          <w:rFonts w:ascii="Times New Roman" w:hAnsi="Times New Roman" w:cs="Times New Roman"/>
-        </w:rPr>
         <w:t>2^</w:t>
       </w:r>
       <w:r>
@@ -3333,7 +4715,19 @@
         <w:rPr>
           <w:rFonts w:ascii="Times New Roman" w:hAnsi="Times New Roman" w:cs="Times New Roman"/>
         </w:rPr>
-        <w:t>2^{17</w:t>
+        <w:t>2^</w:t>
+      </w:r>
+      <w:r>
+        <w:rPr>
+          <w:rFonts w:ascii="Times New Roman" w:hAnsi="Times New Roman" w:cs="Times New Roman"/>
+        </w:rPr>
+        <w:t>(</w:t>
+      </w:r>
+      <w:r>
+        <w:rPr>
+          <w:rFonts w:ascii="Times New Roman" w:hAnsi="Times New Roman" w:cs="Times New Roman"/>
+        </w:rPr>
+        <w:t>17</w:t>
       </w:r>
       <w:r>
         <w:rPr>
@@ -3495,36 +4889,50 @@
         <w:rPr>
           <w:rFonts w:ascii="Times New Roman" w:hAnsi="Times New Roman" w:cs="Times New Roman"/>
         </w:rPr>
+        <w:t>The cipher could be designed so that it cannot be easily divided into independent sections with a simple intermediate matching point.</w:t>
+      </w:r>
+    </w:p>
+    <w:p>
+      <w:pPr>
+        <w:spacing w:after="0"/>
+        <w:rPr>
+          <w:rFonts w:ascii="Times New Roman" w:hAnsi="Times New Roman" w:cs="Times New Roman"/>
+        </w:rPr>
+      </w:pPr>
+      <w:r>
+        <w:rPr>
+          <w:rFonts w:ascii="Times New Roman" w:hAnsi="Times New Roman" w:cs="Times New Roman"/>
+        </w:rPr>
+        <w:t>4. Improve confusion and diffusion.</w:t>
+      </w:r>
+    </w:p>
+    <w:p>
+      <w:pPr>
+        <w:spacing w:after="0"/>
+        <w:rPr>
+          <w:rFonts w:ascii="Times New Roman" w:hAnsi="Times New Roman" w:cs="Times New Roman"/>
+        </w:rPr>
+      </w:pPr>
+      <w:r>
+        <w:rPr>
+          <w:rFonts w:ascii="Times New Roman" w:hAnsi="Times New Roman" w:cs="Times New Roman"/>
+        </w:rPr>
         <w:lastRenderedPageBreak/>
-        <w:t>The cipher could be designed so that it cannot be easily divided into independent sections with a simple intermediate matching point.</w:t>
-      </w:r>
-    </w:p>
-    <w:p>
-      <w:pPr>
-        <w:spacing w:after="0"/>
-        <w:rPr>
-          <w:rFonts w:ascii="Times New Roman" w:hAnsi="Times New Roman" w:cs="Times New Roman"/>
-        </w:rPr>
-      </w:pPr>
-      <w:r>
-        <w:rPr>
-          <w:rFonts w:ascii="Times New Roman" w:hAnsi="Times New Roman" w:cs="Times New Roman"/>
-        </w:rPr>
-        <w:t>4. Improve confusion and diffusion.</w:t>
-      </w:r>
-    </w:p>
-    <w:p>
-      <w:pPr>
-        <w:spacing w:after="0"/>
-        <w:rPr>
-          <w:rFonts w:ascii="Times New Roman" w:hAnsi="Times New Roman" w:cs="Times New Roman"/>
-        </w:rPr>
-      </w:pPr>
-      <w:r>
-        <w:rPr>
-          <w:rFonts w:ascii="Times New Roman" w:hAnsi="Times New Roman" w:cs="Times New Roman"/>
-        </w:rPr>
-        <w:t>Stronger nonlinear substitution and stronger diffusion would make relationships between the plaintext, ciphertext, and key more difficult to analyze. Confusion and diffusion are important properties of substitution-permutation block ciphers. PPT-BlockCiphers-v2026B</w:t>
+        <w:t xml:space="preserve">Stronger nonlinear substitution and stronger diffusion would make relationships between the </w:t>
+      </w:r>
+      <w:proofErr w:type="gramStart"/>
+      <w:r>
+        <w:rPr>
+          <w:rFonts w:ascii="Times New Roman" w:hAnsi="Times New Roman" w:cs="Times New Roman"/>
+        </w:rPr>
+        <w:t>plaintext</w:t>
+      </w:r>
+      <w:proofErr w:type="gramEnd"/>
+      <w:r>
+        <w:rPr>
+          <w:rFonts w:ascii="Times New Roman" w:hAnsi="Times New Roman" w:cs="Times New Roman"/>
+        </w:rPr>
+        <w:t>, ciphertext, and key more difficult to analyze. Confusion and diffusion are important properties of substitution-permutation block ciphers. PPT-BlockCiphers-v2026B</w:t>
       </w:r>
     </w:p>
     <w:p>

</xml_diff>